<commit_message>
Prepare Aurora Forge 1.6.0 RC1
</commit_message>
<xml_diff>
--- a/app/downloads/Aurora_Forge_Reader_Handbook.docx
+++ b/app/downloads/Aurora_Forge_Reader_Handbook.docx
@@ -34717,10 +34717,7 @@
         <w:spacing w:after="80" w:before="0" w:line="259" w:lineRule="auto"/>
       </w:pPr>
       <w:r>
-        <w:rPr>
-          <w:rFonts w:ascii="Noto Sans" w:hAnsi="Noto Sans" w:eastAsia="Noto Sans"/>
-        </w:rPr>
-        <w:t>Reader-First Edition 1.0 was rebuilt from the Aurora Forge v1.6.0.d Complete WWE 2K26 PC Modding Handbook research archive, whose research cutoff was July 26, 2026. The public structure was rewritten on July 27, 2026. Procedures that depend on private, paid, Discord-only, or fast-changing tool screens should be checked against the currently installed tool documentation before use.</w:t>
+        <w:t>This reader edition is maintained for Aurora Forge 1.6.0 RC1. Procedures that depend on private, paid, community-hosted, or fast-changing tool screens should be checked against the currently installed tool documentation before use.</w:t>
       </w:r>
     </w:p>
     <w:p>

</xml_diff>

<commit_message>
Prepare Aurora Forge 1.6.0 RC1 for public release (#2)
* Complete WWE 2K26 CAK filename catalog

* Prepare Aurora Forge 1.6.0 RC1

---------

Co-authored-by: davegranlet <20777780+davegranlet@users.noreply.github.com>
</commit_message>
<xml_diff>
--- a/app/downloads/Aurora_Forge_Reader_Handbook.docx
+++ b/app/downloads/Aurora_Forge_Reader_Handbook.docx
@@ -34717,10 +34717,7 @@
         <w:spacing w:after="80" w:before="0" w:line="259" w:lineRule="auto"/>
       </w:pPr>
       <w:r>
-        <w:rPr>
-          <w:rFonts w:ascii="Noto Sans" w:hAnsi="Noto Sans" w:eastAsia="Noto Sans"/>
-        </w:rPr>
-        <w:t>Reader-First Edition 1.0 was rebuilt from the Aurora Forge v1.6.0.d Complete WWE 2K26 PC Modding Handbook research archive, whose research cutoff was July 26, 2026. The public structure was rewritten on July 27, 2026. Procedures that depend on private, paid, Discord-only, or fast-changing tool screens should be checked against the currently installed tool documentation before use.</w:t>
+        <w:t>This reader edition is maintained for Aurora Forge 1.6.0 RC1. Procedures that depend on private, paid, community-hosted, or fast-changing tool screens should be checked against the currently installed tool documentation before use.</w:t>
       </w:r>
     </w:p>
     <w:p>

</xml_diff>